<commit_message>
Informe final actualizado: seccion de validacion contra el PDF real de la DNRPA (18180 vehiculos, 97% automatico)
</commit_message>
<xml_diff>
--- a/informe/AutoValua_AI_Entrega_Final.docx
+++ b/informe/AutoValua_AI_Entrega_Final.docx
@@ -357,7 +357,7 @@
                 <w:sz w:val="19"/>
                 <w:szCs w:val="19"/>
               </w:rPr>
-              <w:t xml:space="preserve">Incluido junto con este informe — repo git local con 12 commits</w:t>
+              <w:t xml:space="preserve">Incluido junto con este informe — repo git local con 19 commits, incluye validación contra el PDF real de la DNRPA</w:t>
             </w:r>
           </w:p>
         </w:tc>
@@ -881,583 +881,11 @@
     </w:p>
     <w:p>
       <w:pPr>
-        <w:sectPr>
-          <w:headerReference w:type="default" r:id="rId11"/>
-          <w:footerReference w:type="default" r:id="rId12"/>
-          <w:pgSz w:w="11906" w:h="16838" w:orient="portrait"/>
-          <w:pgMar w:top="1080" w:right="1080" w:bottom="1080" w:left="1080" w:header="708" w:footer="708" w:gutter="0"/>
-          <w:pgNumType/>
-          <w:docGrid w:linePitch="360"/>
-        </w:sectPr>
-      </w:pPr>
-    </w:p>
-    <w:p>
-      <w:pPr>
-        <w:pStyle w:val="Heading1"/>
-        <w:spacing w:after="160" w:before="320"/>
-      </w:pPr>
-      <w:r>
-        <w:t xml:space="preserve">Sección 3 — Stack tecnológico</w:t>
-      </w:r>
-    </w:p>
-    <w:tbl>
-      <w:tblPr>
-        <w:tblW w:type="dxa" w:w="9000"/>
-        <w:tblBorders>
-          <w:top w:val="single" w:color="auto" w:sz="4"/>
-          <w:left w:val="single" w:color="auto" w:sz="4"/>
-          <w:bottom w:val="single" w:color="auto" w:sz="4"/>
-          <w:right w:val="single" w:color="auto" w:sz="4"/>
-          <w:insideH w:val="single" w:color="auto" w:sz="4"/>
-          <w:insideV w:val="single" w:color="auto" w:sz="4"/>
-        </w:tblBorders>
-      </w:tblPr>
-      <w:tblGrid>
-        <w:gridCol w:w="1700"/>
-        <w:gridCol w:w="2800"/>
-        <w:gridCol w:w="4500"/>
-      </w:tblGrid>
-      <w:tr>
-        <w:trPr>
-          <w:tblHeader/>
-        </w:trPr>
-        <w:tc>
-          <w:tcPr>
-            <w:tcW w:type="dxa" w:w="1700"/>
-            <w:shd w:fill="1E3A8A" w:val="clear"/>
-            <w:tcMar>
-              <w:top w:type="dxa" w:w="80"/>
-              <w:left w:type="dxa" w:w="100"/>
-              <w:bottom w:type="dxa" w:w="80"/>
-              <w:right w:type="dxa" w:w="100"/>
-            </w:tcMar>
-          </w:tcPr>
-          <w:p>
-            <w:r>
-              <w:rPr>
-                <w:b/>
-                <w:bCs/>
-                <w:color w:val="FFFFFF"/>
-                <w:sz w:val="19"/>
-                <w:szCs w:val="19"/>
-              </w:rPr>
-              <w:t xml:space="preserve">Componente</w:t>
-            </w:r>
-          </w:p>
-        </w:tc>
-        <w:tc>
-          <w:tcPr>
-            <w:tcW w:type="dxa" w:w="2800"/>
-            <w:shd w:fill="1E3A8A" w:val="clear"/>
-            <w:tcMar>
-              <w:top w:type="dxa" w:w="80"/>
-              <w:left w:type="dxa" w:w="100"/>
-              <w:bottom w:type="dxa" w:w="80"/>
-              <w:right w:type="dxa" w:w="100"/>
-            </w:tcMar>
-          </w:tcPr>
-          <w:p>
-            <w:r>
-              <w:rPr>
-                <w:b/>
-                <w:bCs/>
-                <w:color w:val="FFFFFF"/>
-                <w:sz w:val="19"/>
-                <w:szCs w:val="19"/>
-              </w:rPr>
-              <w:t xml:space="preserve">Tecnología / Herramienta</w:t>
-            </w:r>
-          </w:p>
-        </w:tc>
-        <w:tc>
-          <w:tcPr>
-            <w:tcW w:type="dxa" w:w="4500"/>
-            <w:shd w:fill="1E3A8A" w:val="clear"/>
-            <w:tcMar>
-              <w:top w:type="dxa" w:w="80"/>
-              <w:left w:type="dxa" w:w="100"/>
-              <w:bottom w:type="dxa" w:w="80"/>
-              <w:right w:type="dxa" w:w="100"/>
-            </w:tcMar>
-          </w:tcPr>
-          <w:p>
-            <w:r>
-              <w:rPr>
-                <w:b/>
-                <w:bCs/>
-                <w:color w:val="FFFFFF"/>
-                <w:sz w:val="19"/>
-                <w:szCs w:val="19"/>
-              </w:rPr>
-              <w:t xml:space="preserve">Por qué se eligió esta y no otra</w:t>
-            </w:r>
-          </w:p>
-        </w:tc>
-      </w:tr>
-      <w:tr>
-        <w:tc>
-          <w:tcPr>
-            <w:tcW w:type="dxa" w:w="1700"/>
-            <w:shd w:fill="FFFFFF" w:val="clear"/>
-            <w:tcMar>
-              <w:top w:type="dxa" w:w="80"/>
-              <w:left w:type="dxa" w:w="100"/>
-              <w:bottom w:type="dxa" w:w="80"/>
-              <w:right w:type="dxa" w:w="100"/>
-            </w:tcMar>
-          </w:tcPr>
-          <w:p>
-            <w:r>
-              <w:rPr>
-                <w:b w:val="false"/>
-                <w:bCs w:val="false"/>
-                <w:color w:val="1E293B"/>
-                <w:sz w:val="19"/>
-                <w:szCs w:val="19"/>
-              </w:rPr>
-              <w:t xml:space="preserve">Backend</w:t>
-            </w:r>
-          </w:p>
-        </w:tc>
-        <w:tc>
-          <w:tcPr>
-            <w:tcW w:type="dxa" w:w="2800"/>
-            <w:shd w:fill="FFFFFF" w:val="clear"/>
-            <w:tcMar>
-              <w:top w:type="dxa" w:w="80"/>
-              <w:left w:type="dxa" w:w="100"/>
-              <w:bottom w:type="dxa" w:w="80"/>
-              <w:right w:type="dxa" w:w="100"/>
-            </w:tcMar>
-          </w:tcPr>
-          <w:p>
-            <w:r>
-              <w:rPr>
-                <w:b w:val="false"/>
-                <w:bCs w:val="false"/>
-                <w:color w:val="1E293B"/>
-                <w:sz w:val="19"/>
-                <w:szCs w:val="19"/>
-              </w:rPr>
-              <w:t xml:space="preserve">Python 3.12 + FastAPI</w:t>
-            </w:r>
-          </w:p>
-        </w:tc>
-        <w:tc>
-          <w:tcPr>
-            <w:tcW w:type="dxa" w:w="4500"/>
-            <w:shd w:fill="FFFFFF" w:val="clear"/>
-            <w:tcMar>
-              <w:top w:type="dxa" w:w="80"/>
-              <w:left w:type="dxa" w:w="100"/>
-              <w:bottom w:type="dxa" w:w="80"/>
-              <w:right w:type="dxa" w:w="100"/>
-            </w:tcMar>
-          </w:tcPr>
-          <w:p>
-            <w:r>
-              <w:rPr>
-                <w:b w:val="false"/>
-                <w:bCs w:val="false"/>
-                <w:color w:val="1E293B"/>
-                <w:sz w:val="19"/>
-                <w:szCs w:val="19"/>
-              </w:rPr>
-              <w:t xml:space="preserve">Tipado, async nativo, documentación OpenAPI automática — ideal para exponer el segundo canal (API REST) sin código adicional.</w:t>
-            </w:r>
-          </w:p>
-        </w:tc>
-      </w:tr>
-      <w:tr>
-        <w:tc>
-          <w:tcPr>
-            <w:tcW w:type="dxa" w:w="1700"/>
-            <w:shd w:fill="F1F5F9" w:val="clear"/>
-            <w:tcMar>
-              <w:top w:type="dxa" w:w="80"/>
-              <w:left w:type="dxa" w:w="100"/>
-              <w:bottom w:type="dxa" w:w="80"/>
-              <w:right w:type="dxa" w:w="100"/>
-            </w:tcMar>
-          </w:tcPr>
-          <w:p>
-            <w:r>
-              <w:rPr>
-                <w:b w:val="false"/>
-                <w:bCs w:val="false"/>
-                <w:color w:val="1E293B"/>
-                <w:sz w:val="19"/>
-                <w:szCs w:val="19"/>
-              </w:rPr>
-              <w:t xml:space="preserve">Matching difuso</w:t>
-            </w:r>
-          </w:p>
-        </w:tc>
-        <w:tc>
-          <w:tcPr>
-            <w:tcW w:type="dxa" w:w="2800"/>
-            <w:shd w:fill="F1F5F9" w:val="clear"/>
-            <w:tcMar>
-              <w:top w:type="dxa" w:w="80"/>
-              <w:left w:type="dxa" w:w="100"/>
-              <w:bottom w:type="dxa" w:w="80"/>
-              <w:right w:type="dxa" w:w="100"/>
-            </w:tcMar>
-          </w:tcPr>
-          <w:p>
-            <w:r>
-              <w:rPr>
-                <w:b w:val="false"/>
-                <w:bCs w:val="false"/>
-                <w:color w:val="1E293B"/>
-                <w:sz w:val="19"/>
-                <w:szCs w:val="19"/>
-              </w:rPr>
-              <w:t xml:space="preserve">rapidfuzz (token_set_ratio)</w:t>
-            </w:r>
-          </w:p>
-        </w:tc>
-        <w:tc>
-          <w:tcPr>
-            <w:tcW w:type="dxa" w:w="4500"/>
-            <w:shd w:fill="F1F5F9" w:val="clear"/>
-            <w:tcMar>
-              <w:top w:type="dxa" w:w="80"/>
-              <w:left w:type="dxa" w:w="100"/>
-              <w:bottom w:type="dxa" w:w="80"/>
-              <w:right w:type="dxa" w:w="100"/>
-            </w:tcMar>
-          </w:tcPr>
-          <w:p>
-            <w:r>
-              <w:rPr>
-                <w:b w:val="false"/>
-                <w:bCs w:val="false"/>
-                <w:color w:val="1E293B"/>
-                <w:sz w:val="19"/>
-                <w:szCs w:val="19"/>
-              </w:rPr>
-              <w:t xml:space="preserve">Implementación en C++, más rápida que fuzzywuzzy; token_set_ratio evitó el falso-positivo de WRatio en queries genéricas (documentado en agente_matching.py).</w:t>
-            </w:r>
-          </w:p>
-        </w:tc>
-      </w:tr>
-      <w:tr>
-        <w:tc>
-          <w:tcPr>
-            <w:tcW w:type="dxa" w:w="1700"/>
-            <w:shd w:fill="FFFFFF" w:val="clear"/>
-            <w:tcMar>
-              <w:top w:type="dxa" w:w="80"/>
-              <w:left w:type="dxa" w:w="100"/>
-              <w:bottom w:type="dxa" w:w="80"/>
-              <w:right w:type="dxa" w:w="100"/>
-            </w:tcMar>
-          </w:tcPr>
-          <w:p>
-            <w:r>
-              <w:rPr>
-                <w:b w:val="false"/>
-                <w:bCs w:val="false"/>
-                <w:color w:val="1E293B"/>
-                <w:sz w:val="19"/>
-                <w:szCs w:val="19"/>
-              </w:rPr>
-              <w:t xml:space="preserve">Base de datos</w:t>
-            </w:r>
-          </w:p>
-        </w:tc>
-        <w:tc>
-          <w:tcPr>
-            <w:tcW w:type="dxa" w:w="2800"/>
-            <w:shd w:fill="FFFFFF" w:val="clear"/>
-            <w:tcMar>
-              <w:top w:type="dxa" w:w="80"/>
-              <w:left w:type="dxa" w:w="100"/>
-              <w:bottom w:type="dxa" w:w="80"/>
-              <w:right w:type="dxa" w:w="100"/>
-            </w:tcMar>
-          </w:tcPr>
-          <w:p>
-            <w:r>
-              <w:rPr>
-                <w:b w:val="false"/>
-                <w:bCs w:val="false"/>
-                <w:color w:val="1E293B"/>
-                <w:sz w:val="19"/>
-                <w:szCs w:val="19"/>
-              </w:rPr>
-              <w:t xml:space="preserve">SQLite</w:t>
-            </w:r>
-          </w:p>
-        </w:tc>
-        <w:tc>
-          <w:tcPr>
-            <w:tcW w:type="dxa" w:w="4500"/>
-            <w:shd w:fill="FFFFFF" w:val="clear"/>
-            <w:tcMar>
-              <w:top w:type="dxa" w:w="80"/>
-              <w:left w:type="dxa" w:w="100"/>
-              <w:bottom w:type="dxa" w:w="80"/>
-              <w:right w:type="dxa" w:w="100"/>
-            </w:tcMar>
-          </w:tcPr>
-          <w:p>
-            <w:r>
-              <w:rPr>
-                <w:b w:val="false"/>
-                <w:bCs w:val="false"/>
-                <w:color w:val="1E293B"/>
-                <w:sz w:val="19"/>
-                <w:szCs w:val="19"/>
-              </w:rPr>
-              <w:t xml:space="preserve">Prototipo de un solo nodo, cero configuración externa, suficiente para el volumen de esta entrega; el esquema (4 capas de memoria) es portable a Postgres si el proyecto escala.</w:t>
-            </w:r>
-          </w:p>
-        </w:tc>
-      </w:tr>
-      <w:tr>
-        <w:tc>
-          <w:tcPr>
-            <w:tcW w:type="dxa" w:w="1700"/>
-            <w:shd w:fill="F1F5F9" w:val="clear"/>
-            <w:tcMar>
-              <w:top w:type="dxa" w:w="80"/>
-              <w:left w:type="dxa" w:w="100"/>
-              <w:bottom w:type="dxa" w:w="80"/>
-              <w:right w:type="dxa" w:w="100"/>
-            </w:tcMar>
-          </w:tcPr>
-          <w:p>
-            <w:r>
-              <w:rPr>
-                <w:b w:val="false"/>
-                <w:bCs w:val="false"/>
-                <w:color w:val="1E293B"/>
-                <w:sz w:val="19"/>
-                <w:szCs w:val="19"/>
-              </w:rPr>
-              <w:t xml:space="preserve">Frontend</w:t>
-            </w:r>
-          </w:p>
-        </w:tc>
-        <w:tc>
-          <w:tcPr>
-            <w:tcW w:type="dxa" w:w="2800"/>
-            <w:shd w:fill="F1F5F9" w:val="clear"/>
-            <w:tcMar>
-              <w:top w:type="dxa" w:w="80"/>
-              <w:left w:type="dxa" w:w="100"/>
-              <w:bottom w:type="dxa" w:w="80"/>
-              <w:right w:type="dxa" w:w="100"/>
-            </w:tcMar>
-          </w:tcPr>
-          <w:p>
-            <w:r>
-              <w:rPr>
-                <w:b w:val="false"/>
-                <w:bCs w:val="false"/>
-                <w:color w:val="1E293B"/>
-                <w:sz w:val="19"/>
-                <w:szCs w:val="19"/>
-              </w:rPr>
-              <w:t xml:space="preserve">HTML + JS vanilla</w:t>
-            </w:r>
-          </w:p>
-        </w:tc>
-        <w:tc>
-          <w:tcPr>
-            <w:tcW w:type="dxa" w:w="4500"/>
-            <w:shd w:fill="F1F5F9" w:val="clear"/>
-            <w:tcMar>
-              <w:top w:type="dxa" w:w="80"/>
-              <w:left w:type="dxa" w:w="100"/>
-              <w:bottom w:type="dxa" w:w="80"/>
-              <w:right w:type="dxa" w:w="100"/>
-            </w:tcMar>
-          </w:tcPr>
-          <w:p>
-            <w:r>
-              <w:rPr>
-                <w:b w:val="false"/>
-                <w:bCs w:val="false"/>
-                <w:color w:val="1E293B"/>
-                <w:sz w:val="19"/>
-                <w:szCs w:val="19"/>
-              </w:rPr>
-              <w:t xml:space="preserve">Sin build step, servido directo por FastAPI (StaticFiles) — alcanza para demostrar el flujo completo sin la complejidad de un framework SPA.</w:t>
-            </w:r>
-          </w:p>
-        </w:tc>
-      </w:tr>
-      <w:tr>
-        <w:tc>
-          <w:tcPr>
-            <w:tcW w:type="dxa" w:w="1700"/>
-            <w:shd w:fill="FFFFFF" w:val="clear"/>
-            <w:tcMar>
-              <w:top w:type="dxa" w:w="80"/>
-              <w:left w:type="dxa" w:w="100"/>
-              <w:bottom w:type="dxa" w:w="80"/>
-              <w:right w:type="dxa" w:w="100"/>
-            </w:tcMar>
-          </w:tcPr>
-          <w:p>
-            <w:r>
-              <w:rPr>
-                <w:b w:val="false"/>
-                <w:bCs w:val="false"/>
-                <w:color w:val="1E293B"/>
-                <w:sz w:val="19"/>
-                <w:szCs w:val="19"/>
-              </w:rPr>
-              <w:t xml:space="preserve">Autenticación API</w:t>
-            </w:r>
-          </w:p>
-        </w:tc>
-        <w:tc>
-          <w:tcPr>
-            <w:tcW w:type="dxa" w:w="2800"/>
-            <w:shd w:fill="FFFFFF" w:val="clear"/>
-            <w:tcMar>
-              <w:top w:type="dxa" w:w="80"/>
-              <w:left w:type="dxa" w:w="100"/>
-              <w:bottom w:type="dxa" w:w="80"/>
-              <w:right w:type="dxa" w:w="100"/>
-            </w:tcMar>
-          </w:tcPr>
-          <w:p>
-            <w:r>
-              <w:rPr>
-                <w:b w:val="false"/>
-                <w:bCs w:val="false"/>
-                <w:color w:val="1E293B"/>
-                <w:sz w:val="19"/>
-                <w:szCs w:val="19"/>
-              </w:rPr>
-              <w:t xml:space="preserve">Header X-API-Key vía variable de entorno</w:t>
-            </w:r>
-          </w:p>
-        </w:tc>
-        <w:tc>
-          <w:tcPr>
-            <w:tcW w:type="dxa" w:w="4500"/>
-            <w:shd w:fill="FFFFFF" w:val="clear"/>
-            <w:tcMar>
-              <w:top w:type="dxa" w:w="80"/>
-              <w:left w:type="dxa" w:w="100"/>
-              <w:bottom w:type="dxa" w:w="80"/>
-              <w:right w:type="dxa" w:w="100"/>
-            </w:tcMar>
-          </w:tcPr>
-          <w:p>
-            <w:r>
-              <w:rPr>
-                <w:b w:val="false"/>
-                <w:bCs w:val="false"/>
-                <w:color w:val="1E293B"/>
-                <w:sz w:val="19"/>
-                <w:szCs w:val="19"/>
-              </w:rPr>
-              <w:t xml:space="preserve">Suficiente para el caso de uso (integraciones B2B conocidas), sin la complejidad de OAuth para un prototipo académico; las keys nunca quedan hardcodeadas en el código (ver Sección 6).</w:t>
-            </w:r>
-          </w:p>
-        </w:tc>
-      </w:tr>
-      <w:tr>
-        <w:tc>
-          <w:tcPr>
-            <w:tcW w:type="dxa" w:w="1700"/>
-            <w:shd w:fill="F1F5F9" w:val="clear"/>
-            <w:tcMar>
-              <w:top w:type="dxa" w:w="80"/>
-              <w:left w:type="dxa" w:w="100"/>
-              <w:bottom w:type="dxa" w:w="80"/>
-              <w:right w:type="dxa" w:w="100"/>
-            </w:tcMar>
-          </w:tcPr>
-          <w:p>
-            <w:r>
-              <w:rPr>
-                <w:b w:val="false"/>
-                <w:bCs w:val="false"/>
-                <w:color w:val="1E293B"/>
-                <w:sz w:val="19"/>
-                <w:szCs w:val="19"/>
-              </w:rPr>
-              <w:t xml:space="preserve">Despliegue</w:t>
-            </w:r>
-          </w:p>
-        </w:tc>
-        <w:tc>
-          <w:tcPr>
-            <w:tcW w:type="dxa" w:w="2800"/>
-            <w:shd w:fill="F1F5F9" w:val="clear"/>
-            <w:tcMar>
-              <w:top w:type="dxa" w:w="80"/>
-              <w:left w:type="dxa" w:w="100"/>
-              <w:bottom w:type="dxa" w:w="80"/>
-              <w:right w:type="dxa" w:w="100"/>
-            </w:tcMar>
-          </w:tcPr>
-          <w:p>
-            <w:r>
-              <w:rPr>
-                <w:b w:val="false"/>
-                <w:bCs w:val="false"/>
-                <w:color w:val="1E293B"/>
-                <w:sz w:val="19"/>
-                <w:szCs w:val="19"/>
-              </w:rPr>
-              <w:t xml:space="preserve">Render (free tier)</w:t>
-            </w:r>
-          </w:p>
-        </w:tc>
-        <w:tc>
-          <w:tcPr>
-            <w:tcW w:type="dxa" w:w="4500"/>
-            <w:shd w:fill="F1F5F9" w:val="clear"/>
-            <w:tcMar>
-              <w:top w:type="dxa" w:w="80"/>
-              <w:left w:type="dxa" w:w="100"/>
-              <w:bottom w:type="dxa" w:w="80"/>
-              <w:right w:type="dxa" w:w="100"/>
-            </w:tcMar>
-          </w:tcPr>
-          <w:p>
-            <w:r>
-              <w:rPr>
-                <w:b w:val="false"/>
-                <w:bCs w:val="false"/>
-                <w:color w:val="1E293B"/>
-                <w:sz w:val="19"/>
-                <w:szCs w:val="19"/>
-              </w:rPr>
-              <w:t xml:space="preserve">Deploy directo desde GitHub, sin tarjeta de crédito, apto para un prototipo académico.</w:t>
-            </w:r>
-          </w:p>
-        </w:tc>
-      </w:tr>
-    </w:tbl>
-    <w:p>
-      <w:pPr>
-        <w:sectPr>
-          <w:headerReference w:type="default" r:id="rId13"/>
-          <w:footerReference w:type="default" r:id="rId14"/>
-          <w:pgSz w:w="11906" w:h="16838" w:orient="portrait"/>
-          <w:pgMar w:top="1080" w:right="1080" w:bottom="1080" w:left="1080" w:header="708" w:footer="708" w:gutter="0"/>
-          <w:pgNumType/>
-          <w:docGrid w:linePitch="360"/>
-        </w:sectPr>
-      </w:pPr>
-    </w:p>
-    <w:p>
-      <w:pPr>
-        <w:pStyle w:val="Heading1"/>
-        <w:spacing w:after="160" w:before="320"/>
-      </w:pPr>
-      <w:r>
-        <w:t xml:space="preserve">Sección 4 — Evidencia de funcionamiento</w:t>
+        <w:pStyle w:val="Heading2"/>
+        <w:spacing w:after="120" w:before="260"/>
+      </w:pPr>
+      <w:r>
+        <w:t xml:space="preserve">Validación contra el PDF real de la DNRPA</w:t>
       </w:r>
     </w:p>
     <w:p>
@@ -1475,16 +903,100 @@
           <w:sz w:val="22"/>
           <w:szCs w:val="22"/>
         </w:rPr>
-        <w:t xml:space="preserve">Todas las capturas de esta sección corresponden a una sesión real del sistema corriendo (no mockups): se ingirieron las dos vigencias de muestra, el Validador detectó la anomalía de precio inyectada, y se ejecutaron consultas reales contra el catálogo. El log completo de esa sesión (13 pasos, con timestamps y respuestas JSON íntegras) está en el Anexo A.</w:t>
-      </w:r>
-    </w:p>
-    <w:p>
-      <w:pPr>
-        <w:pStyle w:val="Heading2"/>
-        <w:spacing w:after="120" w:before="260"/>
-      </w:pPr>
-      <w:r>
-        <w:t xml:space="preserve">Pantalla principal — chatbot</w:t>
+        <w:t xml:space="preserve">Además del catálogo de muestra, el sistema fue probado contra el archivo oficial real de la DNRPA (vigencia 01/08/2026, 217 páginas, sin modificar). Esto responde directamente al punto más señalado en la devolución de medio ciclo: "es una propuesta de diseño sin prototipo ni validación empírica".</w:t>
+      </w:r>
+    </w:p>
+    <w:p>
+      <w:pPr>
+        <w:spacing w:after="140"/>
+        <w:jc w:val="left"/>
+      </w:pPr>
+      <w:r>
+        <w:rPr>
+          <w:b w:val="false"/>
+          <w:bCs w:val="false"/>
+          <w:i w:val="false"/>
+          <w:iCs w:val="false"/>
+          <w:color w:val="1E293B"/>
+          <w:sz w:val="22"/>
+          <w:szCs w:val="22"/>
+        </w:rPr>
+        <w:t xml:space="preserve">Parsear el archivo real (formato Excel-export) requirió resolver a nivel de carácter — no de palabra pre-tokenizada — tres defectos de layout reales que no aparecían en los datos de muestra:</w:t>
+      </w:r>
+    </w:p>
+    <w:p>
+      <w:pPr>
+        <w:pStyle w:val="ListParagraph"/>
+        <w:numPr>
+          <w:ilvl w:val="0"/>
+          <w:numId w:val="1"/>
+        </w:numPr>
+        <w:spacing w:after="70"/>
+      </w:pPr>
+      <w:r>
+        <w:rPr>
+          <w:b w:val="false"/>
+          <w:bCs w:val="false"/>
+          <w:sz w:val="22"/>
+          <w:szCs w:val="22"/>
+        </w:rPr>
+        <w:t xml:space="preserve">Columnas de precio adyacentes pegadas sin espacio (ej. el valor 0km y el del año más reciente, cuando ambos son largos: "10853271092235000" son en realidad dos valores distintos).</w:t>
+      </w:r>
+    </w:p>
+    <w:p>
+      <w:pPr>
+        <w:pStyle w:val="ListParagraph"/>
+        <w:numPr>
+          <w:ilvl w:val="0"/>
+          <w:numId w:val="1"/>
+        </w:numPr>
+        <w:spacing w:after="70"/>
+      </w:pPr>
+      <w:r>
+        <w:rPr>
+          <w:b w:val="false"/>
+          <w:bCs w:val="false"/>
+          <w:sz w:val="22"/>
+          <w:szCs w:val="22"/>
+        </w:rPr>
+        <w:t xml:space="preserve">Texto de modelo muy largo que se superpone físicamente con la columna de carrocería en el PDF fuente — un defecto real del archivo oficial, no del parser.</w:t>
+      </w:r>
+    </w:p>
+    <w:p>
+      <w:pPr>
+        <w:pStyle w:val="ListParagraph"/>
+        <w:numPr>
+          <w:ilvl w:val="0"/>
+          <w:numId w:val="1"/>
+        </w:numPr>
+        <w:spacing w:after="70"/>
+      </w:pPr>
+      <w:r>
+        <w:rPr>
+          <w:b w:val="false"/>
+          <w:bCs w:val="false"/>
+          <w:sz w:val="22"/>
+          <w:szCs w:val="22"/>
+        </w:rPr>
+        <w:t xml:space="preserve">Códigos de fila que no son 8 dígitos puros (motos con prefijo de letra como "Q4910016", o códigos de 7 dígitos), que inicialmente hacían perder ~40% de las filas al fusionarse con la fila anterior.</w:t>
+      </w:r>
+    </w:p>
+    <w:p>
+      <w:pPr>
+        <w:spacing w:after="140"/>
+        <w:jc w:val="left"/>
+      </w:pPr>
+      <w:r>
+        <w:rPr>
+          <w:b w:val="false"/>
+          <w:bCs w:val="false"/>
+          <w:i w:val="false"/>
+          <w:iCs w:val="false"/>
+          <w:color w:val="1E293B"/>
+          <w:sz w:val="22"/>
+          <w:szCs w:val="22"/>
+        </w:rPr>
+        <w:t xml:space="preserve">Resultado: 18.180 vehículos ingeridos correctamente. El 97% se parseó automáticamente; el 3% restante (548 filas, mayormente categorías raras como cuatriciclos o motocross fuera del vocabulario de carrocerías conocido) quedó escalado al panel administrativo con el texto sin interpretar — la misma regla de diseño aplicada de punta a punta: ante una ambigüedad de formato, el sistema deriva a un humano en vez de adivinar.</w:t>
       </w:r>
     </w:p>
     <w:p>
@@ -1546,16 +1058,7 @@
           <w:sz w:val="18"/>
           <w:szCs w:val="18"/>
         </w:rPr>
-        <w:t xml:space="preserve">El chatbot público, con sugerencias de consulta y aviso legal visible.</w:t>
-      </w:r>
-    </w:p>
-    <w:p>
-      <w:pPr>
-        <w:pStyle w:val="Heading2"/>
-        <w:spacing w:after="120" w:before="260"/>
-      </w:pPr>
-      <w:r>
-        <w:t xml:space="preserve">Flujo de uso — consulta con match automático</w:t>
+        <w:t xml:space="preserve">Consulta real contra el catálogo oficial: "AUDI A4 3.0 QUATTRO", valor $14.157.000 correspondiente al año 2007 (última vigencia con datos para ese modelo en la tabla real).</w:t>
       </w:r>
     </w:p>
     <w:p>
@@ -1566,7 +1069,7 @@
       <w:r>
         <w:drawing>
           <wp:inline distT="0" distB="0" distL="0" distR="0">
-            <wp:extent cx="4572000" cy="2505075"/>
+            <wp:extent cx="4762500" cy="3724275"/>
             <wp:effectExtent t="0" r="0" b="0" l="0"/>
             <wp:docPr id="1" name="" descr="" title=""/>
             <wp:cNvGraphicFramePr>
@@ -1591,7 +1094,7 @@
                   <pic:spPr bwMode="auto">
                     <a:xfrm>
                       <a:off x="0" y="0"/>
-                      <a:ext cx="4572000" cy="2505075"/>
+                      <a:ext cx="4762500" cy="3724275"/>
                     </a:xfrm>
                     <a:prstGeom prst="rect">
                       <a:avLst/>
@@ -1617,7 +1120,606 @@
           <w:sz w:val="18"/>
           <w:szCs w:val="18"/>
         </w:rPr>
-        <w:t xml:space="preserve">Consulta "toyota hilux srx 4x4 2024" → coincidencia exacta, confianza 100%.</w:t>
+        <w:t xml:space="preserve">Panel administrativo mostrando el catálogo real de 18.180 vehículos y los casos escalados por el Ingestor, cada uno con el código, el motivo y el texto original sin interpretar.</w:t>
+      </w:r>
+    </w:p>
+    <w:p>
+      <w:pPr>
+        <w:sectPr>
+          <w:headerReference w:type="default" r:id="rId11"/>
+          <w:footerReference w:type="default" r:id="rId12"/>
+          <w:pgSz w:w="11906" w:h="16838" w:orient="portrait"/>
+          <w:pgMar w:top="1080" w:right="1080" w:bottom="1080" w:left="1080" w:header="708" w:footer="708" w:gutter="0"/>
+          <w:pgNumType/>
+          <w:docGrid w:linePitch="360"/>
+        </w:sectPr>
+      </w:pPr>
+    </w:p>
+    <w:p>
+      <w:pPr>
+        <w:pStyle w:val="Heading1"/>
+        <w:spacing w:after="160" w:before="320"/>
+      </w:pPr>
+      <w:r>
+        <w:t xml:space="preserve">Sección 3 — Stack tecnológico</w:t>
+      </w:r>
+    </w:p>
+    <w:tbl>
+      <w:tblPr>
+        <w:tblW w:type="dxa" w:w="9000"/>
+        <w:tblBorders>
+          <w:top w:val="single" w:color="auto" w:sz="4"/>
+          <w:left w:val="single" w:color="auto" w:sz="4"/>
+          <w:bottom w:val="single" w:color="auto" w:sz="4"/>
+          <w:right w:val="single" w:color="auto" w:sz="4"/>
+          <w:insideH w:val="single" w:color="auto" w:sz="4"/>
+          <w:insideV w:val="single" w:color="auto" w:sz="4"/>
+        </w:tblBorders>
+      </w:tblPr>
+      <w:tblGrid>
+        <w:gridCol w:w="1700"/>
+        <w:gridCol w:w="2800"/>
+        <w:gridCol w:w="4500"/>
+      </w:tblGrid>
+      <w:tr>
+        <w:trPr>
+          <w:tblHeader/>
+        </w:trPr>
+        <w:tc>
+          <w:tcPr>
+            <w:tcW w:type="dxa" w:w="1700"/>
+            <w:shd w:fill="1E3A8A" w:val="clear"/>
+            <w:tcMar>
+              <w:top w:type="dxa" w:w="80"/>
+              <w:left w:type="dxa" w:w="100"/>
+              <w:bottom w:type="dxa" w:w="80"/>
+              <w:right w:type="dxa" w:w="100"/>
+            </w:tcMar>
+          </w:tcPr>
+          <w:p>
+            <w:r>
+              <w:rPr>
+                <w:b/>
+                <w:bCs/>
+                <w:color w:val="FFFFFF"/>
+                <w:sz w:val="19"/>
+                <w:szCs w:val="19"/>
+              </w:rPr>
+              <w:t xml:space="preserve">Componente</w:t>
+            </w:r>
+          </w:p>
+        </w:tc>
+        <w:tc>
+          <w:tcPr>
+            <w:tcW w:type="dxa" w:w="2800"/>
+            <w:shd w:fill="1E3A8A" w:val="clear"/>
+            <w:tcMar>
+              <w:top w:type="dxa" w:w="80"/>
+              <w:left w:type="dxa" w:w="100"/>
+              <w:bottom w:type="dxa" w:w="80"/>
+              <w:right w:type="dxa" w:w="100"/>
+            </w:tcMar>
+          </w:tcPr>
+          <w:p>
+            <w:r>
+              <w:rPr>
+                <w:b/>
+                <w:bCs/>
+                <w:color w:val="FFFFFF"/>
+                <w:sz w:val="19"/>
+                <w:szCs w:val="19"/>
+              </w:rPr>
+              <w:t xml:space="preserve">Tecnología / Herramienta</w:t>
+            </w:r>
+          </w:p>
+        </w:tc>
+        <w:tc>
+          <w:tcPr>
+            <w:tcW w:type="dxa" w:w="4500"/>
+            <w:shd w:fill="1E3A8A" w:val="clear"/>
+            <w:tcMar>
+              <w:top w:type="dxa" w:w="80"/>
+              <w:left w:type="dxa" w:w="100"/>
+              <w:bottom w:type="dxa" w:w="80"/>
+              <w:right w:type="dxa" w:w="100"/>
+            </w:tcMar>
+          </w:tcPr>
+          <w:p>
+            <w:r>
+              <w:rPr>
+                <w:b/>
+                <w:bCs/>
+                <w:color w:val="FFFFFF"/>
+                <w:sz w:val="19"/>
+                <w:szCs w:val="19"/>
+              </w:rPr>
+              <w:t xml:space="preserve">Por qué se eligió esta y no otra</w:t>
+            </w:r>
+          </w:p>
+        </w:tc>
+      </w:tr>
+      <w:tr>
+        <w:tc>
+          <w:tcPr>
+            <w:tcW w:type="dxa" w:w="1700"/>
+            <w:shd w:fill="FFFFFF" w:val="clear"/>
+            <w:tcMar>
+              <w:top w:type="dxa" w:w="80"/>
+              <w:left w:type="dxa" w:w="100"/>
+              <w:bottom w:type="dxa" w:w="80"/>
+              <w:right w:type="dxa" w:w="100"/>
+            </w:tcMar>
+          </w:tcPr>
+          <w:p>
+            <w:r>
+              <w:rPr>
+                <w:b w:val="false"/>
+                <w:bCs w:val="false"/>
+                <w:color w:val="1E293B"/>
+                <w:sz w:val="19"/>
+                <w:szCs w:val="19"/>
+              </w:rPr>
+              <w:t xml:space="preserve">Backend</w:t>
+            </w:r>
+          </w:p>
+        </w:tc>
+        <w:tc>
+          <w:tcPr>
+            <w:tcW w:type="dxa" w:w="2800"/>
+            <w:shd w:fill="FFFFFF" w:val="clear"/>
+            <w:tcMar>
+              <w:top w:type="dxa" w:w="80"/>
+              <w:left w:type="dxa" w:w="100"/>
+              <w:bottom w:type="dxa" w:w="80"/>
+              <w:right w:type="dxa" w:w="100"/>
+            </w:tcMar>
+          </w:tcPr>
+          <w:p>
+            <w:r>
+              <w:rPr>
+                <w:b w:val="false"/>
+                <w:bCs w:val="false"/>
+                <w:color w:val="1E293B"/>
+                <w:sz w:val="19"/>
+                <w:szCs w:val="19"/>
+              </w:rPr>
+              <w:t xml:space="preserve">Python 3.12 + FastAPI</w:t>
+            </w:r>
+          </w:p>
+        </w:tc>
+        <w:tc>
+          <w:tcPr>
+            <w:tcW w:type="dxa" w:w="4500"/>
+            <w:shd w:fill="FFFFFF" w:val="clear"/>
+            <w:tcMar>
+              <w:top w:type="dxa" w:w="80"/>
+              <w:left w:type="dxa" w:w="100"/>
+              <w:bottom w:type="dxa" w:w="80"/>
+              <w:right w:type="dxa" w:w="100"/>
+            </w:tcMar>
+          </w:tcPr>
+          <w:p>
+            <w:r>
+              <w:rPr>
+                <w:b w:val="false"/>
+                <w:bCs w:val="false"/>
+                <w:color w:val="1E293B"/>
+                <w:sz w:val="19"/>
+                <w:szCs w:val="19"/>
+              </w:rPr>
+              <w:t xml:space="preserve">Tipado, async nativo, documentación OpenAPI automática — ideal para exponer el segundo canal (API REST) sin código adicional.</w:t>
+            </w:r>
+          </w:p>
+        </w:tc>
+      </w:tr>
+      <w:tr>
+        <w:tc>
+          <w:tcPr>
+            <w:tcW w:type="dxa" w:w="1700"/>
+            <w:shd w:fill="F1F5F9" w:val="clear"/>
+            <w:tcMar>
+              <w:top w:type="dxa" w:w="80"/>
+              <w:left w:type="dxa" w:w="100"/>
+              <w:bottom w:type="dxa" w:w="80"/>
+              <w:right w:type="dxa" w:w="100"/>
+            </w:tcMar>
+          </w:tcPr>
+          <w:p>
+            <w:r>
+              <w:rPr>
+                <w:b w:val="false"/>
+                <w:bCs w:val="false"/>
+                <w:color w:val="1E293B"/>
+                <w:sz w:val="19"/>
+                <w:szCs w:val="19"/>
+              </w:rPr>
+              <w:t xml:space="preserve">Matching difuso</w:t>
+            </w:r>
+          </w:p>
+        </w:tc>
+        <w:tc>
+          <w:tcPr>
+            <w:tcW w:type="dxa" w:w="2800"/>
+            <w:shd w:fill="F1F5F9" w:val="clear"/>
+            <w:tcMar>
+              <w:top w:type="dxa" w:w="80"/>
+              <w:left w:type="dxa" w:w="100"/>
+              <w:bottom w:type="dxa" w:w="80"/>
+              <w:right w:type="dxa" w:w="100"/>
+            </w:tcMar>
+          </w:tcPr>
+          <w:p>
+            <w:r>
+              <w:rPr>
+                <w:b w:val="false"/>
+                <w:bCs w:val="false"/>
+                <w:color w:val="1E293B"/>
+                <w:sz w:val="19"/>
+                <w:szCs w:val="19"/>
+              </w:rPr>
+              <w:t xml:space="preserve">rapidfuzz (token_set_ratio)</w:t>
+            </w:r>
+          </w:p>
+        </w:tc>
+        <w:tc>
+          <w:tcPr>
+            <w:tcW w:type="dxa" w:w="4500"/>
+            <w:shd w:fill="F1F5F9" w:val="clear"/>
+            <w:tcMar>
+              <w:top w:type="dxa" w:w="80"/>
+              <w:left w:type="dxa" w:w="100"/>
+              <w:bottom w:type="dxa" w:w="80"/>
+              <w:right w:type="dxa" w:w="100"/>
+            </w:tcMar>
+          </w:tcPr>
+          <w:p>
+            <w:r>
+              <w:rPr>
+                <w:b w:val="false"/>
+                <w:bCs w:val="false"/>
+                <w:color w:val="1E293B"/>
+                <w:sz w:val="19"/>
+                <w:szCs w:val="19"/>
+              </w:rPr>
+              <w:t xml:space="preserve">Implementación en C++, más rápida que fuzzywuzzy; token_set_ratio evitó el falso-positivo de WRatio en queries genéricas (documentado en agente_matching.py).</w:t>
+            </w:r>
+          </w:p>
+        </w:tc>
+      </w:tr>
+      <w:tr>
+        <w:tc>
+          <w:tcPr>
+            <w:tcW w:type="dxa" w:w="1700"/>
+            <w:shd w:fill="FFFFFF" w:val="clear"/>
+            <w:tcMar>
+              <w:top w:type="dxa" w:w="80"/>
+              <w:left w:type="dxa" w:w="100"/>
+              <w:bottom w:type="dxa" w:w="80"/>
+              <w:right w:type="dxa" w:w="100"/>
+            </w:tcMar>
+          </w:tcPr>
+          <w:p>
+            <w:r>
+              <w:rPr>
+                <w:b w:val="false"/>
+                <w:bCs w:val="false"/>
+                <w:color w:val="1E293B"/>
+                <w:sz w:val="19"/>
+                <w:szCs w:val="19"/>
+              </w:rPr>
+              <w:t xml:space="preserve">Base de datos</w:t>
+            </w:r>
+          </w:p>
+        </w:tc>
+        <w:tc>
+          <w:tcPr>
+            <w:tcW w:type="dxa" w:w="2800"/>
+            <w:shd w:fill="FFFFFF" w:val="clear"/>
+            <w:tcMar>
+              <w:top w:type="dxa" w:w="80"/>
+              <w:left w:type="dxa" w:w="100"/>
+              <w:bottom w:type="dxa" w:w="80"/>
+              <w:right w:type="dxa" w:w="100"/>
+            </w:tcMar>
+          </w:tcPr>
+          <w:p>
+            <w:r>
+              <w:rPr>
+                <w:b w:val="false"/>
+                <w:bCs w:val="false"/>
+                <w:color w:val="1E293B"/>
+                <w:sz w:val="19"/>
+                <w:szCs w:val="19"/>
+              </w:rPr>
+              <w:t xml:space="preserve">SQLite</w:t>
+            </w:r>
+          </w:p>
+        </w:tc>
+        <w:tc>
+          <w:tcPr>
+            <w:tcW w:type="dxa" w:w="4500"/>
+            <w:shd w:fill="FFFFFF" w:val="clear"/>
+            <w:tcMar>
+              <w:top w:type="dxa" w:w="80"/>
+              <w:left w:type="dxa" w:w="100"/>
+              <w:bottom w:type="dxa" w:w="80"/>
+              <w:right w:type="dxa" w:w="100"/>
+            </w:tcMar>
+          </w:tcPr>
+          <w:p>
+            <w:r>
+              <w:rPr>
+                <w:b w:val="false"/>
+                <w:bCs w:val="false"/>
+                <w:color w:val="1E293B"/>
+                <w:sz w:val="19"/>
+                <w:szCs w:val="19"/>
+              </w:rPr>
+              <w:t xml:space="preserve">Prototipo de un solo nodo, cero configuración externa, suficiente para el volumen de esta entrega; el esquema (4 capas de memoria) es portable a Postgres si el proyecto escala.</w:t>
+            </w:r>
+          </w:p>
+        </w:tc>
+      </w:tr>
+      <w:tr>
+        <w:tc>
+          <w:tcPr>
+            <w:tcW w:type="dxa" w:w="1700"/>
+            <w:shd w:fill="F1F5F9" w:val="clear"/>
+            <w:tcMar>
+              <w:top w:type="dxa" w:w="80"/>
+              <w:left w:type="dxa" w:w="100"/>
+              <w:bottom w:type="dxa" w:w="80"/>
+              <w:right w:type="dxa" w:w="100"/>
+            </w:tcMar>
+          </w:tcPr>
+          <w:p>
+            <w:r>
+              <w:rPr>
+                <w:b w:val="false"/>
+                <w:bCs w:val="false"/>
+                <w:color w:val="1E293B"/>
+                <w:sz w:val="19"/>
+                <w:szCs w:val="19"/>
+              </w:rPr>
+              <w:t xml:space="preserve">Frontend</w:t>
+            </w:r>
+          </w:p>
+        </w:tc>
+        <w:tc>
+          <w:tcPr>
+            <w:tcW w:type="dxa" w:w="2800"/>
+            <w:shd w:fill="F1F5F9" w:val="clear"/>
+            <w:tcMar>
+              <w:top w:type="dxa" w:w="80"/>
+              <w:left w:type="dxa" w:w="100"/>
+              <w:bottom w:type="dxa" w:w="80"/>
+              <w:right w:type="dxa" w:w="100"/>
+            </w:tcMar>
+          </w:tcPr>
+          <w:p>
+            <w:r>
+              <w:rPr>
+                <w:b w:val="false"/>
+                <w:bCs w:val="false"/>
+                <w:color w:val="1E293B"/>
+                <w:sz w:val="19"/>
+                <w:szCs w:val="19"/>
+              </w:rPr>
+              <w:t xml:space="preserve">HTML + JS vanilla</w:t>
+            </w:r>
+          </w:p>
+        </w:tc>
+        <w:tc>
+          <w:tcPr>
+            <w:tcW w:type="dxa" w:w="4500"/>
+            <w:shd w:fill="F1F5F9" w:val="clear"/>
+            <w:tcMar>
+              <w:top w:type="dxa" w:w="80"/>
+              <w:left w:type="dxa" w:w="100"/>
+              <w:bottom w:type="dxa" w:w="80"/>
+              <w:right w:type="dxa" w:w="100"/>
+            </w:tcMar>
+          </w:tcPr>
+          <w:p>
+            <w:r>
+              <w:rPr>
+                <w:b w:val="false"/>
+                <w:bCs w:val="false"/>
+                <w:color w:val="1E293B"/>
+                <w:sz w:val="19"/>
+                <w:szCs w:val="19"/>
+              </w:rPr>
+              <w:t xml:space="preserve">Sin build step, servido directo por FastAPI (StaticFiles) — alcanza para demostrar el flujo completo sin la complejidad de un framework SPA.</w:t>
+            </w:r>
+          </w:p>
+        </w:tc>
+      </w:tr>
+      <w:tr>
+        <w:tc>
+          <w:tcPr>
+            <w:tcW w:type="dxa" w:w="1700"/>
+            <w:shd w:fill="FFFFFF" w:val="clear"/>
+            <w:tcMar>
+              <w:top w:type="dxa" w:w="80"/>
+              <w:left w:type="dxa" w:w="100"/>
+              <w:bottom w:type="dxa" w:w="80"/>
+              <w:right w:type="dxa" w:w="100"/>
+            </w:tcMar>
+          </w:tcPr>
+          <w:p>
+            <w:r>
+              <w:rPr>
+                <w:b w:val="false"/>
+                <w:bCs w:val="false"/>
+                <w:color w:val="1E293B"/>
+                <w:sz w:val="19"/>
+                <w:szCs w:val="19"/>
+              </w:rPr>
+              <w:t xml:space="preserve">Autenticación API</w:t>
+            </w:r>
+          </w:p>
+        </w:tc>
+        <w:tc>
+          <w:tcPr>
+            <w:tcW w:type="dxa" w:w="2800"/>
+            <w:shd w:fill="FFFFFF" w:val="clear"/>
+            <w:tcMar>
+              <w:top w:type="dxa" w:w="80"/>
+              <w:left w:type="dxa" w:w="100"/>
+              <w:bottom w:type="dxa" w:w="80"/>
+              <w:right w:type="dxa" w:w="100"/>
+            </w:tcMar>
+          </w:tcPr>
+          <w:p>
+            <w:r>
+              <w:rPr>
+                <w:b w:val="false"/>
+                <w:bCs w:val="false"/>
+                <w:color w:val="1E293B"/>
+                <w:sz w:val="19"/>
+                <w:szCs w:val="19"/>
+              </w:rPr>
+              <w:t xml:space="preserve">Header X-API-Key vía variable de entorno</w:t>
+            </w:r>
+          </w:p>
+        </w:tc>
+        <w:tc>
+          <w:tcPr>
+            <w:tcW w:type="dxa" w:w="4500"/>
+            <w:shd w:fill="FFFFFF" w:val="clear"/>
+            <w:tcMar>
+              <w:top w:type="dxa" w:w="80"/>
+              <w:left w:type="dxa" w:w="100"/>
+              <w:bottom w:type="dxa" w:w="80"/>
+              <w:right w:type="dxa" w:w="100"/>
+            </w:tcMar>
+          </w:tcPr>
+          <w:p>
+            <w:r>
+              <w:rPr>
+                <w:b w:val="false"/>
+                <w:bCs w:val="false"/>
+                <w:color w:val="1E293B"/>
+                <w:sz w:val="19"/>
+                <w:szCs w:val="19"/>
+              </w:rPr>
+              <w:t xml:space="preserve">Suficiente para el caso de uso (integraciones B2B conocidas), sin la complejidad de OAuth para un prototipo académico; las keys nunca quedan hardcodeadas en el código (ver Sección 6).</w:t>
+            </w:r>
+          </w:p>
+        </w:tc>
+      </w:tr>
+      <w:tr>
+        <w:tc>
+          <w:tcPr>
+            <w:tcW w:type="dxa" w:w="1700"/>
+            <w:shd w:fill="F1F5F9" w:val="clear"/>
+            <w:tcMar>
+              <w:top w:type="dxa" w:w="80"/>
+              <w:left w:type="dxa" w:w="100"/>
+              <w:bottom w:type="dxa" w:w="80"/>
+              <w:right w:type="dxa" w:w="100"/>
+            </w:tcMar>
+          </w:tcPr>
+          <w:p>
+            <w:r>
+              <w:rPr>
+                <w:b w:val="false"/>
+                <w:bCs w:val="false"/>
+                <w:color w:val="1E293B"/>
+                <w:sz w:val="19"/>
+                <w:szCs w:val="19"/>
+              </w:rPr>
+              <w:t xml:space="preserve">Despliegue</w:t>
+            </w:r>
+          </w:p>
+        </w:tc>
+        <w:tc>
+          <w:tcPr>
+            <w:tcW w:type="dxa" w:w="2800"/>
+            <w:shd w:fill="F1F5F9" w:val="clear"/>
+            <w:tcMar>
+              <w:top w:type="dxa" w:w="80"/>
+              <w:left w:type="dxa" w:w="100"/>
+              <w:bottom w:type="dxa" w:w="80"/>
+              <w:right w:type="dxa" w:w="100"/>
+            </w:tcMar>
+          </w:tcPr>
+          <w:p>
+            <w:r>
+              <w:rPr>
+                <w:b w:val="false"/>
+                <w:bCs w:val="false"/>
+                <w:color w:val="1E293B"/>
+                <w:sz w:val="19"/>
+                <w:szCs w:val="19"/>
+              </w:rPr>
+              <w:t xml:space="preserve">Render (free tier)</w:t>
+            </w:r>
+          </w:p>
+        </w:tc>
+        <w:tc>
+          <w:tcPr>
+            <w:tcW w:type="dxa" w:w="4500"/>
+            <w:shd w:fill="F1F5F9" w:val="clear"/>
+            <w:tcMar>
+              <w:top w:type="dxa" w:w="80"/>
+              <w:left w:type="dxa" w:w="100"/>
+              <w:bottom w:type="dxa" w:w="80"/>
+              <w:right w:type="dxa" w:w="100"/>
+            </w:tcMar>
+          </w:tcPr>
+          <w:p>
+            <w:r>
+              <w:rPr>
+                <w:b w:val="false"/>
+                <w:bCs w:val="false"/>
+                <w:color w:val="1E293B"/>
+                <w:sz w:val="19"/>
+                <w:szCs w:val="19"/>
+              </w:rPr>
+              <w:t xml:space="preserve">Deploy directo desde GitHub, sin tarjeta de crédito, apto para un prototipo académico.</w:t>
+            </w:r>
+          </w:p>
+        </w:tc>
+      </w:tr>
+    </w:tbl>
+    <w:p>
+      <w:pPr>
+        <w:sectPr>
+          <w:headerReference w:type="default" r:id="rId13"/>
+          <w:footerReference w:type="default" r:id="rId14"/>
+          <w:pgSz w:w="11906" w:h="16838" w:orient="portrait"/>
+          <w:pgMar w:top="1080" w:right="1080" w:bottom="1080" w:left="1080" w:header="708" w:footer="708" w:gutter="0"/>
+          <w:pgNumType/>
+          <w:docGrid w:linePitch="360"/>
+        </w:sectPr>
+      </w:pPr>
+    </w:p>
+    <w:p>
+      <w:pPr>
+        <w:pStyle w:val="Heading1"/>
+        <w:spacing w:after="160" w:before="320"/>
+      </w:pPr>
+      <w:r>
+        <w:t xml:space="preserve">Sección 4 — Evidencia de funcionamiento</w:t>
+      </w:r>
+    </w:p>
+    <w:p>
+      <w:pPr>
+        <w:spacing w:after="140"/>
+        <w:jc w:val="left"/>
+      </w:pPr>
+      <w:r>
+        <w:rPr>
+          <w:b w:val="false"/>
+          <w:bCs w:val="false"/>
+          <w:i w:val="false"/>
+          <w:iCs w:val="false"/>
+          <w:color w:val="1E293B"/>
+          <w:sz w:val="22"/>
+          <w:szCs w:val="22"/>
+        </w:rPr>
+        <w:t xml:space="preserve">Todas las capturas de esta sección corresponden a una sesión real del sistema corriendo (no mockups): se ingirieron las dos vigencias de muestra, el Validador detectó la anomalía de precio inyectada, y se ejecutaron consultas reales contra el catálogo. El log completo de esa sesión (13 pasos, con timestamps y respuestas JSON íntegras) está en el Anexo A.</w:t>
       </w:r>
     </w:p>
     <w:p>
@@ -1626,7 +1728,7 @@
         <w:spacing w:after="120" w:before="260"/>
       </w:pPr>
       <w:r>
-        <w:t xml:space="preserve">Flujo de uso — fuzzy matching con error de tipeo</w:t>
+        <w:t xml:space="preserve">Pantalla principal — chatbot</w:t>
       </w:r>
     </w:p>
     <w:p>
@@ -1688,7 +1790,7 @@
           <w:sz w:val="18"/>
           <w:szCs w:val="18"/>
         </w:rPr>
-        <w:t xml:space="preserve">Consulta "corola xei 2021" (typo real) → match por segunda estrategia (fuzzy solo-modelo), confianza 80%. El badge amarillo comunica que no fue un match perfecto.</w:t>
+        <w:t xml:space="preserve">El chatbot público, con sugerencias de consulta y aviso legal visible.</w:t>
       </w:r>
     </w:p>
     <w:p>
@@ -1697,7 +1799,7 @@
         <w:spacing w:after="120" w:before="260"/>
       </w:pPr>
       <w:r>
-        <w:t xml:space="preserve">Resultado de la IA — consulta ambigua escalada a humano</w:t>
+        <w:t xml:space="preserve">Flujo de uso — consulta con match automático</w:t>
       </w:r>
     </w:p>
     <w:p>
@@ -1759,7 +1861,7 @@
           <w:sz w:val="18"/>
           <w:szCs w:val="18"/>
         </w:rPr>
-        <w:t xml:space="preserve">Consulta genérica "auto 1.6 5 puertas" → ninguna estrategia superó el umbral de 80; el sistema muestra los 3 candidatos evaluados y sus scores, y deriva el caso al equipo humano en vez de adivinar.</w:t>
+        <w:t xml:space="preserve">Consulta "toyota hilux srx 4x4 2024" → coincidencia exacta, confianza 100%.</w:t>
       </w:r>
     </w:p>
     <w:p>
@@ -1768,7 +1870,7 @@
         <w:spacing w:after="120" w:before="260"/>
       </w:pPr>
       <w:r>
-        <w:t xml:space="preserve">Regla anti-alucinación en acción</w:t>
+        <w:t xml:space="preserve">Flujo de uso — fuzzy matching con error de tipeo</w:t>
       </w:r>
     </w:p>
     <w:p>
@@ -1830,7 +1932,7 @@
           <w:sz w:val="18"/>
           <w:szCs w:val="18"/>
         </w:rPr>
-        <w:t xml:space="preserve">Consulta "lamborghini aventador 2024" (vehículo inexistente en el catálogo) → el sistema responde "no encontrado" en vez de estimar un valor.</w:t>
+        <w:t xml:space="preserve">Consulta "corola xei 2021" (typo real) → match por segunda estrategia (fuzzy solo-modelo), confianza 80%. El badge amarillo comunica que no fue un match perfecto.</w:t>
       </w:r>
     </w:p>
     <w:p>
@@ -1839,7 +1941,7 @@
         <w:spacing w:after="120" w:before="260"/>
       </w:pPr>
       <w:r>
-        <w:t xml:space="preserve">Panel administrativo — casos escalados y ciclo de ingesta</w:t>
+        <w:t xml:space="preserve">Resultado de la IA — consulta ambigua escalada a humano</w:t>
       </w:r>
     </w:p>
     <w:p>
@@ -1850,7 +1952,7 @@
       <w:r>
         <w:drawing>
           <wp:inline distT="0" distB="0" distL="0" distR="0">
-            <wp:extent cx="4762500" cy="4848225"/>
+            <wp:extent cx="4572000" cy="2505075"/>
             <wp:effectExtent t="0" r="0" b="0" l="0"/>
             <wp:docPr id="1" name="" descr="" title=""/>
             <wp:cNvGraphicFramePr>
@@ -1875,6 +1977,148 @@
                   <pic:spPr bwMode="auto">
                     <a:xfrm>
                       <a:off x="0" y="0"/>
+                      <a:ext cx="4572000" cy="2505075"/>
+                    </a:xfrm>
+                    <a:prstGeom prst="rect">
+                      <a:avLst/>
+                    </a:prstGeom>
+                  </pic:spPr>
+                </pic:pic>
+              </a:graphicData>
+            </a:graphic>
+          </wp:inline>
+        </w:drawing>
+      </w:r>
+    </w:p>
+    <w:p>
+      <w:pPr>
+        <w:spacing w:after="260"/>
+        <w:jc w:val="center"/>
+      </w:pPr>
+      <w:r>
+        <w:rPr>
+          <w:i/>
+          <w:iCs/>
+          <w:color w:val="64748B"/>
+          <w:sz w:val="18"/>
+          <w:szCs w:val="18"/>
+        </w:rPr>
+        <w:t xml:space="preserve">Consulta genérica "auto 1.6 5 puertas" → ninguna estrategia superó el umbral de 80; el sistema muestra los 3 candidatos evaluados y sus scores, y deriva el caso al equipo humano en vez de adivinar.</w:t>
+      </w:r>
+    </w:p>
+    <w:p>
+      <w:pPr>
+        <w:pStyle w:val="Heading2"/>
+        <w:spacing w:after="120" w:before="260"/>
+      </w:pPr>
+      <w:r>
+        <w:t xml:space="preserve">Regla anti-alucinación en acción</w:t>
+      </w:r>
+    </w:p>
+    <w:p>
+      <w:pPr>
+        <w:spacing w:after="60"/>
+        <w:jc w:val="center"/>
+      </w:pPr>
+      <w:r>
+        <w:drawing>
+          <wp:inline distT="0" distB="0" distL="0" distR="0">
+            <wp:extent cx="4572000" cy="2505075"/>
+            <wp:effectExtent t="0" r="0" b="0" l="0"/>
+            <wp:docPr id="1" name="" descr="" title=""/>
+            <wp:cNvGraphicFramePr>
+              <a:graphicFrameLocks xmlns:a="http://schemas.openxmlformats.org/drawingml/2006/main" noChangeAspect="1"/>
+            </wp:cNvGraphicFramePr>
+            <a:graphic xmlns:a="http://schemas.openxmlformats.org/drawingml/2006/main">
+              <a:graphicData uri="http://schemas.openxmlformats.org/drawingml/2006/picture">
+                <pic:pic xmlns:pic="http://schemas.openxmlformats.org/drawingml/2006/picture">
+                  <pic:nvPicPr>
+                    <pic:cNvPr id="0" name="" descr=""/>
+                    <pic:cNvPicPr>
+                      <a:picLocks noChangeAspect="1" noChangeArrowheads="1"/>
+                    </pic:cNvPicPr>
+                  </pic:nvPicPr>
+                  <pic:blipFill>
+                    <a:blip r:embed="rId34" cstate="none"/>
+                    <a:srcRect/>
+                    <a:stretch>
+                      <a:fillRect/>
+                    </a:stretch>
+                  </pic:blipFill>
+                  <pic:spPr bwMode="auto">
+                    <a:xfrm>
+                      <a:off x="0" y="0"/>
+                      <a:ext cx="4572000" cy="2505075"/>
+                    </a:xfrm>
+                    <a:prstGeom prst="rect">
+                      <a:avLst/>
+                    </a:prstGeom>
+                  </pic:spPr>
+                </pic:pic>
+              </a:graphicData>
+            </a:graphic>
+          </wp:inline>
+        </w:drawing>
+      </w:r>
+    </w:p>
+    <w:p>
+      <w:pPr>
+        <w:spacing w:after="260"/>
+        <w:jc w:val="center"/>
+      </w:pPr>
+      <w:r>
+        <w:rPr>
+          <w:i/>
+          <w:iCs/>
+          <w:color w:val="64748B"/>
+          <w:sz w:val="18"/>
+          <w:szCs w:val="18"/>
+        </w:rPr>
+        <w:t xml:space="preserve">Consulta "lamborghini aventador 2024" (vehículo inexistente en el catálogo) → el sistema responde "no encontrado" en vez de estimar un valor.</w:t>
+      </w:r>
+    </w:p>
+    <w:p>
+      <w:pPr>
+        <w:pStyle w:val="Heading2"/>
+        <w:spacing w:after="120" w:before="260"/>
+      </w:pPr>
+      <w:r>
+        <w:t xml:space="preserve">Panel administrativo — casos escalados y ciclo de ingesta</w:t>
+      </w:r>
+    </w:p>
+    <w:p>
+      <w:pPr>
+        <w:spacing w:after="60"/>
+        <w:jc w:val="center"/>
+      </w:pPr>
+      <w:r>
+        <w:drawing>
+          <wp:inline distT="0" distB="0" distL="0" distR="0">
+            <wp:extent cx="4762500" cy="4848225"/>
+            <wp:effectExtent t="0" r="0" b="0" l="0"/>
+            <wp:docPr id="1" name="" descr="" title=""/>
+            <wp:cNvGraphicFramePr>
+              <a:graphicFrameLocks xmlns:a="http://schemas.openxmlformats.org/drawingml/2006/main" noChangeAspect="1"/>
+            </wp:cNvGraphicFramePr>
+            <a:graphic xmlns:a="http://schemas.openxmlformats.org/drawingml/2006/main">
+              <a:graphicData uri="http://schemas.openxmlformats.org/drawingml/2006/picture">
+                <pic:pic xmlns:pic="http://schemas.openxmlformats.org/drawingml/2006/picture">
+                  <pic:nvPicPr>
+                    <pic:cNvPr id="0" name="" descr=""/>
+                    <pic:cNvPicPr>
+                      <a:picLocks noChangeAspect="1" noChangeArrowheads="1"/>
+                    </pic:cNvPicPr>
+                  </pic:nvPicPr>
+                  <pic:blipFill>
+                    <a:blip r:embed="rId35" cstate="none"/>
+                    <a:srcRect/>
+                    <a:stretch>
+                      <a:fillRect/>
+                    </a:stretch>
+                  </pic:blipFill>
+                  <pic:spPr bwMode="auto">
+                    <a:xfrm>
+                      <a:off x="0" y="0"/>
                       <a:ext cx="4762500" cy="4848225"/>
                     </a:xfrm>
                     <a:prstGeom prst="rect">
@@ -1937,7 +2181,7 @@
                     </pic:cNvPicPr>
                   </pic:nvPicPr>
                   <pic:blipFill>
-                    <a:blip r:embed="rId34" cstate="none"/>
+                    <a:blip r:embed="rId36" cstate="none"/>
                     <a:srcRect/>
                     <a:stretch>
                       <a:fillRect/>

</xml_diff>